<commit_message>
Remove Tareq Shikdar from author list; update contributions and README citation
</commit_message>
<xml_diff>
--- a/ML-BMS-Review.docx
+++ b/ML-BMS-Review.docx
@@ -90,36 +90,6 @@
           <w:sz w:val="22"/>
         </w:rPr>
         <w:t>Jasimul Islam Chowdhury</w:t>
-      </w:r>
-    </w:p>
-    <w:p>
-      <w:pPr>
-        <w:spacing w:after="200"/>
-        <w:jc w:val="center"/>
-      </w:pPr>
-      <w:r>
-        <w:rPr>
-          <w:rFonts w:ascii="Times New Roman" w:hAnsi="Times New Roman"/>
-          <w:b w:val="0"/>
-          <w:i/>
-          <w:sz w:val="18"/>
-        </w:rPr>
-        <w:t>Leading University, Sylhet, Bangladesh</w:t>
-      </w:r>
-    </w:p>
-    <w:p>
-      <w:pPr>
-        <w:spacing w:after="40"/>
-        <w:jc w:val="center"/>
-      </w:pPr>
-      <w:r>
-        <w:rPr>
-          <w:rFonts w:ascii="Times New Roman" w:hAnsi="Times New Roman"/>
-          <w:b/>
-          <w:i w:val="0"/>
-          <w:sz w:val="22"/>
-        </w:rPr>
-        <w:t>Tareq Shikdar</w:t>
       </w:r>
     </w:p>
     <w:p>
@@ -15211,7 +15181,7 @@
           <w:rFonts w:ascii="Times New Roman" w:hAnsi="Times New Roman"/>
           <w:sz w:val="20"/>
         </w:rPr>
-        <w:t>H.T.S. conceived the study, designed and executed the search, screening, and verification pipeline, performed the classification and analysis, and drafted the manuscript. S.S.I.A., J.I.C., and T.S. contributed to corpus curation, verification of classifications and counts, and manuscript revision. All authors read and approved the final manuscript.</w:t>
+        <w:t>H.T.S. conceived the study, designed and executed the search, screening, and verification pipeline, performed the classification and analysis, and drafted the manuscript. S.S.I.A. and J.I.C. contributed to corpus curation, verification of classifications and counts, and manuscript revision. All authors read and approved the final manuscript.</w:t>
       </w:r>
     </w:p>
     <w:p>

</xml_diff>

<commit_message>
Figure polish: center Fig. 5 layout with in-bar labels; enlarge Fig. 8 timeline text and render at display width
</commit_message>
<xml_diff>
--- a/ML-BMS-Review.docx
+++ b/ML-BMS-Review.docx
@@ -5462,7 +5462,7 @@
       <w:r>
         <w:drawing>
           <wp:inline xmlns:a="http://schemas.openxmlformats.org/drawingml/2006/main" xmlns:pic="http://schemas.openxmlformats.org/drawingml/2006/picture">
-            <wp:extent cx="4480560" cy="2520315"/>
+            <wp:extent cx="4480560" cy="2320290"/>
             <wp:docPr id="5" name="Picture 5"/>
             <wp:cNvGraphicFramePr>
               <a:graphicFrameLocks noChangeAspect="1"/>
@@ -5483,7 +5483,7 @@
                   <pic:spPr>
                     <a:xfrm>
                       <a:off x="0" y="0"/>
-                      <a:ext cx="4480560" cy="2520315"/>
+                      <a:ext cx="4480560" cy="2320290"/>
                     </a:xfrm>
                     <a:prstGeom prst="rect"/>
                   </pic:spPr>
@@ -14884,7 +14884,7 @@
       <w:r>
         <w:drawing>
           <wp:inline xmlns:a="http://schemas.openxmlformats.org/drawingml/2006/main" xmlns:pic="http://schemas.openxmlformats.org/drawingml/2006/picture">
-            <wp:extent cx="4480560" cy="2036618"/>
+            <wp:extent cx="5852160" cy="2610964"/>
             <wp:docPr id="8" name="Picture 8"/>
             <wp:cNvGraphicFramePr>
               <a:graphicFrameLocks noChangeAspect="1"/>
@@ -14905,7 +14905,7 @@
                   <pic:spPr>
                     <a:xfrm>
                       <a:off x="0" y="0"/>
-                      <a:ext cx="4480560" cy="2036618"/>
+                      <a:ext cx="5852160" cy="2610964"/>
                     </a:xfrm>
                     <a:prstGeom prst="rect"/>
                   </pic:spPr>

</xml_diff>